<commit_message>
Spanish Part 5: episodes 57-59; align price timing, Amparo's departure day and design name with 60-62
Co-Authored-By: Claude Opus 5.5 <noreply@anthropic.com>
Claude-Session: https://claude.ai/code/session_014Pwa4fJotSRvNewqVrvk7U
</commit_message>
<xml_diff>
--- a/business_es/part5/ep61_Ppalli_ppalli.docx
+++ b/business_es/part5/ep61_Ppalli_ppalli.docx
@@ -2997,7 +2997,7 @@
           <w:sz w:val="22"/>
         </w:rPr>
         <w:tab/>
-        <w:t>A mí también. Y una cosa más, que aprendimos en Monterrey: el diseño para Hanul. Nuria tiene una idea, «Blanco Lumière». Que sea solo para Hanul en Corea, tres años.</w:t>
+        <w:t>A mí también. Y una cosa más, que aprendimos en Monterrey: el diseño para Hanul. Nuria tiene una idea para cambiar el nombre de trabajo, «Blanco Hangang»: «Blanco Lumière». Que sea solo para Hanul en Corea, tres años.</w:t>
       </w:r>
     </w:p>
     <w:p>
@@ -9752,7 +9752,7 @@
           <w:sz w:val="21"/>
         </w:rPr>
         <w:tab/>
-        <w:t>저도요. 그리고 하나 더, 몬테레이에서 배운 거예요. 한울용 디자인이요. 누리아한테 'Blanco Lumière'라는 아이디어가 있어요. 한국에선 3년간 한울 전용으로 해요.</w:t>
+        <w:t>저도요. 그리고 하나 더, 몬테레이에서 배운 거예요. 한울용 디자인이요. 누리아가 가제 'Blanco Hangang' 대신 'Blanco Lumière'라는 아이디어를 냈어요. 한국에선 3년간 한울 전용으로 해요.</w:t>
       </w:r>
     </w:p>
     <w:p>

</xml_diff>